<commit_message>
Irrigation as a county covariate (scripts 29-30) and report update
Script 29 pulls county irrigated soybean acreage from the NASS Census of
Agriculture bulk files (2017, 2022; no API key). Illinois is ~1.9% irrigated
statewide, concentrated on the Illinois River sand-plain counties.

Script 30 tests it against the script 09 climate-sensitivity coefficients, the
same design as script 16 used for soil. Result: more-irrigated counties respond
significantly less to natural moisture variation (coef -0.26, p=0.013, R2=0.07),
no relationship with heat sensitivity or yield level. Survives a robustness
check restricted to non-disclosure-suppressed counties.

Folded into results/FINAL_REPORT.md and the Word report (script 27) and README.

Co-Authored-By: Claude Sonnet 5 <noreply@anthropic.com>
</commit_message>
<xml_diff>
--- a/results/Illinois_Soybean_Climate_Report.docx
+++ b/results/Illinois_Soybean_Climate_Report.docx
@@ -11315,6 +11315,363 @@
     </w:p>
     <w:p>
       <w:pPr>
+        <w:pStyle w:val="Heading3"/>
+      </w:pPr>
+      <w:r>
+        <w:t>Irrigation</w:t>
+      </w:r>
+    </w:p>
+    <w:p>
+      <w:r>
+        <w:t>A second static county attribute, checked the same way. Illinois soybean is overwhelmingly rainfed: script 29 pulls county irrigated-acreage from the NASS Census of Agriculture (2017 and 2022, the only two years it is published), and the statewide mean is 1.9% of harvested acres. It is not spread evenly — the irrigated share concentrates on the Illinois River sand-plain counties, up to 43% in the highest county — which makes it a plausible candidate to explain part of the county-level heterogeneity Section 5.8 could not attribute to soil.</w:t>
+      </w:r>
+    </w:p>
+    <w:p>
+      <w:r>
+        <w:t>It does, a little. Regressed against the script 09 sensitivity coefficients (log of irrigated percentage, 91 counties):</w:t>
+      </w:r>
+    </w:p>
+    <w:tbl>
+      <w:tblPr>
+        <w:tblStyle w:val="TableGrid"/>
+        <w:tblW w:type="auto" w:w="0"/>
+        <w:jc w:val="center"/>
+        <w:tblCellMar>
+          <w:top w:w="40" w:type="dxa"/>
+          <w:left w:w="70" w:type="dxa"/>
+          <w:bottom w:w="40" w:type="dxa"/>
+          <w:right w:w="70" w:type="dxa"/>
+        </w:tblCellMar>
+        <w:tblLook w:firstColumn="1" w:firstRow="1" w:lastColumn="0" w:lastRow="0" w:noHBand="0" w:noVBand="1" w:val="04A0"/>
+      </w:tblPr>
+      <w:tblGrid>
+        <w:gridCol w:w="2340"/>
+        <w:gridCol w:w="2340"/>
+        <w:gridCol w:w="2340"/>
+        <w:gridCol w:w="2340"/>
+      </w:tblGrid>
+      <w:tr>
+        <w:trPr>
+          <w:tblHeader w:val="true"/>
+        </w:trPr>
+        <w:tc>
+          <w:tcPr>
+            <w:tcW w:type="dxa" w:w="2340"/>
+            <w:shd w:val="clear" w:color="auto" w:fill="DCE6F1"/>
+          </w:tcPr>
+          <w:p>
+            <w:pPr>
+              <w:spacing w:after="0" w:before="0"/>
+            </w:pPr>
+            <w:r/>
+            <w:r>
+              <w:rPr>
+                <w:b/>
+                <w:sz w:val="18"/>
+              </w:rPr>
+              <w:t>County sensitivity coefficient</w:t>
+            </w:r>
+          </w:p>
+        </w:tc>
+        <w:tc>
+          <w:tcPr>
+            <w:tcW w:type="dxa" w:w="2340"/>
+            <w:shd w:val="clear" w:color="auto" w:fill="DCE6F1"/>
+          </w:tcPr>
+          <w:p>
+            <w:pPr>
+              <w:spacing w:after="0" w:before="0"/>
+            </w:pPr>
+            <w:r/>
+            <w:r>
+              <w:rPr>
+                <w:b/>
+                <w:sz w:val="18"/>
+              </w:rPr>
+              <w:t>R²</w:t>
+            </w:r>
+          </w:p>
+        </w:tc>
+        <w:tc>
+          <w:tcPr>
+            <w:tcW w:type="dxa" w:w="2340"/>
+            <w:shd w:val="clear" w:color="auto" w:fill="DCE6F1"/>
+          </w:tcPr>
+          <w:p>
+            <w:pPr>
+              <w:spacing w:after="0" w:before="0"/>
+            </w:pPr>
+            <w:r/>
+            <w:r>
+              <w:rPr>
+                <w:b/>
+                <w:sz w:val="18"/>
+              </w:rPr>
+              <w:t>Coefficient</w:t>
+            </w:r>
+          </w:p>
+        </w:tc>
+        <w:tc>
+          <w:tcPr>
+            <w:tcW w:type="dxa" w:w="2340"/>
+            <w:shd w:val="clear" w:color="auto" w:fill="DCE6F1"/>
+          </w:tcPr>
+          <w:p>
+            <w:pPr>
+              <w:spacing w:after="0" w:before="0"/>
+            </w:pPr>
+            <w:r/>
+            <w:r>
+              <w:rPr>
+                <w:b/>
+                <w:sz w:val="18"/>
+              </w:rPr>
+              <w:t>p</w:t>
+            </w:r>
+          </w:p>
+        </w:tc>
+      </w:tr>
+      <w:tr>
+        <w:trPr>
+          <w:cantSplit w:val="true"/>
+        </w:trPr>
+        <w:tc>
+          <w:tcPr>
+            <w:tcW w:type="dxa" w:w="2340"/>
+          </w:tcPr>
+          <w:p>
+            <w:pPr>
+              <w:spacing w:after="0" w:before="0"/>
+            </w:pPr>
+            <w:r/>
+            <w:r>
+              <w:rPr>
+                <w:sz w:val="18"/>
+              </w:rPr>
+              <w:t>yield response to moisture (bu/SD)</w:t>
+            </w:r>
+          </w:p>
+        </w:tc>
+        <w:tc>
+          <w:tcPr>
+            <w:tcW w:type="dxa" w:w="2340"/>
+          </w:tcPr>
+          <w:p>
+            <w:pPr>
+              <w:spacing w:after="0" w:before="0"/>
+            </w:pPr>
+            <w:r/>
+            <w:r>
+              <w:rPr>
+                <w:sz w:val="18"/>
+              </w:rPr>
+              <w:t>0.067</w:t>
+            </w:r>
+          </w:p>
+        </w:tc>
+        <w:tc>
+          <w:tcPr>
+            <w:tcW w:type="dxa" w:w="2340"/>
+          </w:tcPr>
+          <w:p>
+            <w:pPr>
+              <w:spacing w:after="0" w:before="0"/>
+            </w:pPr>
+            <w:r/>
+            <w:r>
+              <w:rPr>
+                <w:sz w:val="18"/>
+              </w:rPr>
+              <w:t>−0.265</w:t>
+            </w:r>
+          </w:p>
+        </w:tc>
+        <w:tc>
+          <w:tcPr>
+            <w:tcW w:type="dxa" w:w="2340"/>
+          </w:tcPr>
+          <w:p>
+            <w:pPr>
+              <w:spacing w:after="0" w:before="0"/>
+            </w:pPr>
+            <w:r/>
+            <w:r>
+              <w:rPr>
+                <w:sz w:val="18"/>
+              </w:rPr>
+              <w:t>0.013</w:t>
+            </w:r>
+          </w:p>
+        </w:tc>
+      </w:tr>
+      <w:tr>
+        <w:trPr>
+          <w:cantSplit w:val="true"/>
+        </w:trPr>
+        <w:tc>
+          <w:tcPr>
+            <w:tcW w:type="dxa" w:w="2340"/>
+          </w:tcPr>
+          <w:p>
+            <w:pPr>
+              <w:spacing w:after="0" w:before="0"/>
+            </w:pPr>
+            <w:r/>
+            <w:r>
+              <w:rPr>
+                <w:sz w:val="18"/>
+              </w:rPr>
+              <w:t>yield response to heat (bu/SD)</w:t>
+            </w:r>
+          </w:p>
+        </w:tc>
+        <w:tc>
+          <w:tcPr>
+            <w:tcW w:type="dxa" w:w="2340"/>
+          </w:tcPr>
+          <w:p>
+            <w:pPr>
+              <w:spacing w:after="0" w:before="0"/>
+            </w:pPr>
+            <w:r/>
+            <w:r>
+              <w:rPr>
+                <w:sz w:val="18"/>
+              </w:rPr>
+              <w:t>0.007</w:t>
+            </w:r>
+          </w:p>
+        </w:tc>
+        <w:tc>
+          <w:tcPr>
+            <w:tcW w:type="dxa" w:w="2340"/>
+          </w:tcPr>
+          <w:p>
+            <w:pPr>
+              <w:spacing w:after="0" w:before="0"/>
+            </w:pPr>
+            <w:r/>
+            <w:r>
+              <w:rPr>
+                <w:sz w:val="18"/>
+              </w:rPr>
+              <w:t>−0.079</w:t>
+            </w:r>
+          </w:p>
+        </w:tc>
+        <w:tc>
+          <w:tcPr>
+            <w:tcW w:type="dxa" w:w="2340"/>
+          </w:tcPr>
+          <w:p>
+            <w:pPr>
+              <w:spacing w:after="0" w:before="0"/>
+            </w:pPr>
+            <w:r/>
+            <w:r>
+              <w:rPr>
+                <w:sz w:val="18"/>
+              </w:rPr>
+              <w:t>0.415</w:t>
+            </w:r>
+          </w:p>
+        </w:tc>
+      </w:tr>
+      <w:tr>
+        <w:trPr>
+          <w:cantSplit w:val="true"/>
+        </w:trPr>
+        <w:tc>
+          <w:tcPr>
+            <w:tcW w:type="dxa" w:w="2340"/>
+          </w:tcPr>
+          <w:p>
+            <w:pPr>
+              <w:spacing w:after="0" w:before="0"/>
+            </w:pPr>
+            <w:r/>
+            <w:r>
+              <w:rPr>
+                <w:sz w:val="18"/>
+              </w:rPr>
+              <w:t>composite sensitivity index</w:t>
+            </w:r>
+          </w:p>
+        </w:tc>
+        <w:tc>
+          <w:tcPr>
+            <w:tcW w:type="dxa" w:w="2340"/>
+          </w:tcPr>
+          <w:p>
+            <w:pPr>
+              <w:spacing w:after="0" w:before="0"/>
+            </w:pPr>
+            <w:r/>
+            <w:r>
+              <w:rPr>
+                <w:sz w:val="18"/>
+              </w:rPr>
+              <w:t>0.003</w:t>
+            </w:r>
+          </w:p>
+        </w:tc>
+        <w:tc>
+          <w:tcPr>
+            <w:tcW w:type="dxa" w:w="2340"/>
+          </w:tcPr>
+          <w:p>
+            <w:pPr>
+              <w:spacing w:after="0" w:before="0"/>
+            </w:pPr>
+            <w:r/>
+            <w:r>
+              <w:rPr>
+                <w:sz w:val="18"/>
+              </w:rPr>
+              <w:t>−0.016</w:t>
+            </w:r>
+          </w:p>
+        </w:tc>
+        <w:tc>
+          <w:tcPr>
+            <w:tcW w:type="dxa" w:w="2340"/>
+          </w:tcPr>
+          <w:p>
+            <w:pPr>
+              <w:spacing w:after="0" w:before="0"/>
+            </w:pPr>
+            <w:r/>
+            <w:r>
+              <w:rPr>
+                <w:sz w:val="18"/>
+              </w:rPr>
+              <w:t>0.631</w:t>
+            </w:r>
+          </w:p>
+        </w:tc>
+      </w:tr>
+    </w:tbl>
+    <w:p>
+      <w:pPr>
+        <w:spacing w:after="40"/>
+      </w:pPr>
+    </w:p>
+    <w:p>
+      <w:r>
+        <w:t xml:space="preserve">More irrigated counties respond </w:t>
+      </w:r>
+      <w:r>
+        <w:rPr>
+          <w:b/>
+        </w:rPr>
+        <w:t>less</w:t>
+      </w:r>
+      <w:r>
+        <w:t xml:space="preserve"> to natural moisture variation (−0.265 per log-point, p = 0.013), which is the expected sign: irrigation buffers a dry August. It says nothing about heat response or the yield level, both statistically indistinguishable from zero. The R² is small (0.067), and the result survives the obvious check: restricted to the 59 counties whose irrigated-acreage figure was never disclosure-suppressed (suppressed values are coded 0 rather than dropped, which could otherwise manufacture the correlation), the coefficient holds (−0.279, p = 0.011). Not built into the scenarios: script 20 applies one pooled moisture response to every county, irrigated or not, so the SSP5-8.5 losses are if anything slightly overstated for the small share of acreage that is irrigated today.</w:t>
+      </w:r>
+    </w:p>
+    <w:p>
+      <w:pPr>
         <w:pStyle w:val="Heading2"/>
       </w:pPr>
       <w:r>
@@ -22332,6 +22689,174 @@
                 <w:sz w:val="18"/>
               </w:rPr>
               <w:t>FINAL_REPORT.md, Illinois_Soybean_Climate_Report.docx</w:t>
+            </w:r>
+          </w:p>
+        </w:tc>
+      </w:tr>
+      <w:tr>
+        <w:trPr>
+          <w:cantSplit w:val="true"/>
+        </w:trPr>
+        <w:tc>
+          <w:tcPr>
+            <w:tcW w:type="dxa" w:w="3120"/>
+          </w:tcPr>
+          <w:p>
+            <w:pPr>
+              <w:spacing w:after="0" w:before="0"/>
+            </w:pPr>
+            <w:r/>
+            <w:r>
+              <w:rPr>
+                <w:sz w:val="18"/>
+              </w:rPr>
+              <w:t>28</w:t>
+            </w:r>
+          </w:p>
+        </w:tc>
+        <w:tc>
+          <w:tcPr>
+            <w:tcW w:type="dxa" w:w="3120"/>
+          </w:tcPr>
+          <w:p>
+            <w:pPr>
+              <w:spacing w:after="0" w:before="0"/>
+            </w:pPr>
+            <w:r/>
+            <w:r>
+              <w:rPr>
+                <w:sz w:val="18"/>
+              </w:rPr>
+              <w:t>IPCC AR6 SPM-style summary figure</w:t>
+            </w:r>
+          </w:p>
+        </w:tc>
+        <w:tc>
+          <w:tcPr>
+            <w:tcW w:type="dxa" w:w="3120"/>
+          </w:tcPr>
+          <w:p>
+            <w:pPr>
+              <w:spacing w:after="0" w:before="0"/>
+            </w:pPr>
+            <w:r/>
+            <w:r>
+              <w:rPr>
+                <w:sz w:val="18"/>
+              </w:rPr>
+              <w:t>fig34</w:t>
+            </w:r>
+          </w:p>
+        </w:tc>
+      </w:tr>
+      <w:tr>
+        <w:trPr>
+          <w:cantSplit w:val="true"/>
+        </w:trPr>
+        <w:tc>
+          <w:tcPr>
+            <w:tcW w:type="dxa" w:w="3120"/>
+          </w:tcPr>
+          <w:p>
+            <w:pPr>
+              <w:spacing w:after="0" w:before="0"/>
+            </w:pPr>
+            <w:r/>
+            <w:r>
+              <w:rPr>
+                <w:sz w:val="18"/>
+              </w:rPr>
+              <w:t>29</w:t>
+            </w:r>
+          </w:p>
+        </w:tc>
+        <w:tc>
+          <w:tcPr>
+            <w:tcW w:type="dxa" w:w="3120"/>
+          </w:tcPr>
+          <w:p>
+            <w:pPr>
+              <w:spacing w:after="0" w:before="0"/>
+            </w:pPr>
+            <w:r/>
+            <w:r>
+              <w:rPr>
+                <w:sz w:val="18"/>
+              </w:rPr>
+              <w:t>County irrigated-acreage download, NASS Census of Agriculture</w:t>
+            </w:r>
+          </w:p>
+        </w:tc>
+        <w:tc>
+          <w:tcPr>
+            <w:tcW w:type="dxa" w:w="3120"/>
+          </w:tcPr>
+          <w:p>
+            <w:pPr>
+              <w:spacing w:after="0" w:before="0"/>
+            </w:pPr>
+            <w:r/>
+            <w:r>
+              <w:rPr>
+                <w:sz w:val="18"/>
+              </w:rPr>
+              <w:t>irrigation_features.csv</w:t>
+            </w:r>
+          </w:p>
+        </w:tc>
+      </w:tr>
+      <w:tr>
+        <w:trPr>
+          <w:cantSplit w:val="true"/>
+        </w:trPr>
+        <w:tc>
+          <w:tcPr>
+            <w:tcW w:type="dxa" w:w="3120"/>
+          </w:tcPr>
+          <w:p>
+            <w:pPr>
+              <w:spacing w:after="0" w:before="0"/>
+            </w:pPr>
+            <w:r/>
+            <w:r>
+              <w:rPr>
+                <w:sz w:val="18"/>
+              </w:rPr>
+              <w:t>30</w:t>
+            </w:r>
+          </w:p>
+        </w:tc>
+        <w:tc>
+          <w:tcPr>
+            <w:tcW w:type="dxa" w:w="3120"/>
+          </w:tcPr>
+          <w:p>
+            <w:pPr>
+              <w:spacing w:after="0" w:before="0"/>
+            </w:pPr>
+            <w:r/>
+            <w:r>
+              <w:rPr>
+                <w:sz w:val="18"/>
+              </w:rPr>
+              <w:t>Irrigation vs climate sensitivity</w:t>
+            </w:r>
+          </w:p>
+        </w:tc>
+        <w:tc>
+          <w:tcPr>
+            <w:tcW w:type="dxa" w:w="3120"/>
+          </w:tcPr>
+          <w:p>
+            <w:pPr>
+              <w:spacing w:after="0" w:before="0"/>
+            </w:pPr>
+            <w:r/>
+            <w:r>
+              <w:rPr>
+                <w:sz w:val="18"/>
+              </w:rPr>
+              <w:t>tables 39-40b</w:t>
             </w:r>
           </w:p>
         </w:tc>

</xml_diff>